<commit_message>
Validate compiled CC2538 firmware on four Renode MCUs and update Array manuscript
Retain three policy controls, fifteen firmware/radio probes, raw UART captures and independent signature/provenance audit. Add reproduction and Android/physical-board boundaries. Recheck 73 tests and frozen policy action identity; preserve original experimental outcomes.
</commit_message>
<xml_diff>
--- a/publication/array/Array_Manuscript.docx
+++ b/publication/array/Array_Manuscript.docx
@@ -101,7 +101,7 @@
           <w:color w:val="000000"/>
           <w:sz w:val="22"/>
         </w:rPr>
-        <w:t>Routing feedback consumes radio capacity and may confuse missing evidence with forwarding failure. We evaluate receipt assisted feedback and a separate authenticated transport for frozen sensor-routing policies. The first experiment fixes the feedback ledger before 750 IEEE 802.15.4 simulation runs on 30 new fixtures, with active proof, naive passive, frozen prior and capacity matched policy controls. Under blackholes, delivery increases from 71.28% to 75.94% relative to active proofs, a paired gain of 4.67 percentage points (95% interval 2.36–6.97; Holm adjusted p=0.0161). Energy per delivered byte improves while total modeled radio energy increases slightly. A second protocol evaluates attention, multilayer perceptron and greedy routing in 180 runs using byte-serialized neighbor state, hop authentication, replay protection and signed sink receipts. Attention delivery is 81.61% in benign conditions and 61.11% with selective dropping; paired comparisons establish no superiority over the controls. Four virtual serial devices also exercise the host radio adapter and reveal a receive-time freshness bug, which is corrected. The corrected integration delivers all ten offered packets in that functional fixture. These results provide traceable feedback and implementation evidence while exposing transfer and attribution limits. Virtual serial interfaces and modeled radio energy do not establish board firmware execution, physical energy consumption or absolute deadline compliance.</w:t>
+        <w:t>Routing feedback consumes radio capacity and may confuse missing evidence with forwarding failure. We evaluate receipt assisted feedback and a separate authenticated transport for frozen sensor-routing policies. The first experiment fixes the feedback ledger before 750 IEEE 802.15.4 simulation runs on 30 new fixtures, with active proof, naive passive, frozen prior and capacity matched policy controls. Under blackholes, delivery increases from 71.28% to 75.94% relative to active proofs, a paired gain of 4.67 percentage points (95% interval 2.36–6.97; Holm adjusted p=0.0161). Energy per delivered byte improves while total modeled radio energy increases slightly. A second protocol evaluates attention, multilayer perceptron and greedy routing in 180 runs using byte-serialized neighbor state, hop authentication, replay protection and signed sink receipts. Attention delivery is 81.61% in benign conditions and 61.11% with selective dropping; paired comparisons establish no superiority over the controls. Four virtual serial devices also exercise the host radio adapter and reveal a receive-time freshness bug, which is corrected. The corrected integration delivers all ten offered packets in that functional fixture. A separate four-board Cortex-M3 emulator executes compiled radio-interface firmware; all three host-policy controls deliver ten of ten packets. These results provide traceable feedback and implementation evidence while exposing transfer and attribution limits. Virtual serial interfaces and modeled radio energy do not establish physical board operation, measured energy consumption or absolute deadline compliance.</w:t>
       </w:r>
     </w:p>
     <w:p>
@@ -2346,7 +2346,20 @@
           <w:color w:val="000000"/>
           <w:sz w:val="22"/>
         </w:rPr>
-        <w:t>The virtual devices execute a software interface model. They do not execute an MCU instruction set, a compiled board firmware image, real UART timing or a physical radio. Their energy telemetry is explicitly marked simulated. Physical validation still requires a selected board, board-specific firmware, calibrated current traces and real packet captures. A virtual run cannot replace those measurements. Learned-policy transfer is evaluated separately in Section 5.2; the four-port serial fixture uses greedy routing.</w:t>
+        <w:t>The pseudo-terminal devices model the firmware API without MCU execution. Rechecks with greedy, multilayer perceptron and attention host policies each deliver ten of ten packets. A separate Renode 1.17.0 backend executes compiled C firmware on four emulated CC2538 ARM Cortex-M3 boards (Fig. 7). Firmware parses UART JSON, enforces frame bounds, drives the IEEE 802.15.4 radio FIFO and correlates MAC acknowledgments. Host processes retain routing inference and cryptography. All three controls deliver ten of ten packets and return ten verified source receipts each. Each run passes five probes: labeled uncalibrated telemetry, exact 114-byte delivery and acknowledgment, rejection of 115-byte frames, malformed-hex rejection and failed out-of-range transmission. The independent capture audit verifies received bytes against MCU UART output, public sink signatures and packet identities. Two development captures are retained separately for startup synchronization and public-key metadata corrections.</w:t>
+      </w:r>
+    </w:p>
+    <w:p>
+      <w:pPr>
+        <w:spacing w:line="276" w:lineRule="auto"/>
+      </w:pPr>
+      <w:r>
+        <w:rPr>
+          <w:rFonts w:ascii="Times New Roman" w:hAnsi="Times New Roman"/>
+          <w:color w:val="000000"/>
+          <w:sz w:val="22"/>
+        </w:rPr>
+        <w:t>Renode uses a deterministic range medium, not the ns-3 physical-layer model of the statistical study. Its energy fraction is a fixed placeholder explicitly labeled emulated_no_power_model; queue telemetry counts pending MCU acknowledgment records. No battery result follows from this fixture. The four-node chain provides one feasible next hop per relay, so successful execution does not compare policy quality or estimate reliability. Deadline debts remain nonzero. Compiled firmware execution is demonstrated only in emulation; physical clock and pin initialization, embedded policy/crypto execution, physical RF behavior and calibrated current measurements remain unvalidated.</w:t>
       </w:r>
     </w:p>
     <w:p>
@@ -2486,7 +2499,7 @@
           <w:color w:val="000000"/>
           <w:sz w:val="22"/>
         </w:rPr>
-        <w:t>Receipt assisted passive feedback passed a prespecified incremental gate on 30 new simulation fixtures, improving blackhole delivery by 4.67 percentage points over active proofs. Matched controls did not establish a unique censoring or attention advantage. A separate authenticated transport executes frozen attention and capacity matched policies using received wire state and local service records. Its 180-run transfer study also establishes no attention superiority. Virtual serial devices expose and help correct a host receive-time defect. Together, these stages support a reproducible feedback comparison and an auditable implementation boundary. Absolute service compliance, embedded firmware execution and physical energy validation remain open.</w:t>
+        <w:t>Receipt assisted passive feedback passed a prespecified incremental gate on 30 new simulation fixtures, improving blackhole delivery by 4.67 percentage points over active proofs. Matched controls did not establish a unique censoring or attention advantage. A separate authenticated transport executes frozen attention and capacity matched policies using received wire state and local service records. Its 180-run transfer study also establishes no attention superiority. Virtual serial devices expose and help correct a host receive-time defect. Together, these stages support a reproducible feedback comparison and an auditable implementation boundary. Compiled radio-interface firmware also executes on four emulated Cortex-M3 boards. Absolute service compliance, physical-board firmware operation, embedded policy/crypto execution and physical energy validation remain open.</w:t>
       </w:r>
     </w:p>
     <w:p>
@@ -6978,7 +6991,7 @@
       <w:r>
         <w:drawing>
           <wp:inline xmlns:a="http://schemas.openxmlformats.org/drawingml/2006/main" xmlns:pic="http://schemas.openxmlformats.org/drawingml/2006/picture">
-            <wp:extent cx="5760000" cy="3171236"/>
+            <wp:extent cx="5760000" cy="4142022"/>
             <wp:docPr id="7" name="Picture 7"/>
             <wp:cNvGraphicFramePr>
               <a:graphicFrameLocks noChangeAspect="1"/>
@@ -6999,7 +7012,7 @@
                   <pic:spPr>
                     <a:xfrm>
                       <a:off x="0" y="0"/>
-                      <a:ext cx="5760000" cy="3171236"/>
+                      <a:ext cx="5760000" cy="4142022"/>
                     </a:xfrm>
                     <a:prstGeom prst="rect"/>
                   </pic:spPr>

</xml_diff>

<commit_message>
Require complete delivery and accepted receipts before MCU integration passes
Add per-run fail-closed capture audit, temporal TX provenance and ten rejection regression cases. Retain and flag incomplete legacy greedy evidence; run three fresh strict controls. Consolidate current docs, update Array manuscript and prepare author-review declarations and physical validation protocol. 83 tests pass; physical/embedded and author/portal gates remain explicitly open.
</commit_message>
<xml_diff>
--- a/publication/array/Array_Manuscript.docx
+++ b/publication/array/Array_Manuscript.docx
@@ -2132,7 +2132,7 @@
           <w:color w:val="000000"/>
           <w:sz w:val="22"/>
         </w:rPr>
-        <w:t>The action/ledger verifier passed 67,522 decisions, 24,747 passive observations, 28,353 evidence updates and 75,750 node-energy identities. An additional endpoint audit reconstructed all 750 final delivery and critical-violation values from source decision times and sink reception events, checked beacon and decision counts, and reconciled PHY-state energy. All 30 gzip streams read successfully to end of stream. The frozen-stage 51-test suite and radio callback control passed; the expanded implementation suite now contains 73 passing tests.</w:t>
+        <w:t>The action/ledger verifier passed 67,522 decisions, 24,747 passive observations, 28,353 evidence updates and 75,750 node-energy identities. An additional endpoint audit reconstructed all 750 final delivery and critical-violation values from source decision times and sink reception events, checked beacon and decision counts, and reconciled PHY-state energy. All 30 gzip streams read successfully to end of stream. The frozen-stage 51-test suite and radio callback control passed; the expanded implementation suite now contains 83 passing tests.</w:t>
       </w:r>
     </w:p>
     <w:p>
@@ -2346,7 +2346,7 @@
           <w:color w:val="000000"/>
           <w:sz w:val="22"/>
         </w:rPr>
-        <w:t>The pseudo-terminal devices model the firmware API without MCU execution. Rechecks with greedy, multilayer perceptron and attention host policies each deliver ten of ten packets. A separate Renode 1.17.0 backend executes compiled C firmware on four emulated CC2538 ARM Cortex-M3 boards (Fig. 7). Firmware parses UART JSON, enforces frame bounds, drives the IEEE 802.15.4 radio FIFO and correlates MAC acknowledgments. Host processes retain routing inference and cryptography. All three controls deliver ten of ten packets and return ten verified source receipts each. Each run passes five probes: labeled uncalibrated telemetry, exact 114-byte delivery and acknowledgment, rejection of 115-byte frames, malformed-hex rejection and failed out-of-range transmission. The independent capture audit verifies received bytes against MCU UART output, public sink signatures and packet identities. Two development captures are retained separately for startup synchronization and public-key metadata corrections.</w:t>
+        <w:t>The pseudo-terminal devices model the firmware API without MCU execution. Rechecks with greedy, multilayer perceptron and attention host policies each deliver ten of ten packets. A separate Renode 1.17.0 backend executes compiled C firmware on four emulated CC2538 ARM Cortex-M3 boards (Fig. 7). Firmware parses UART JSON, enforces frame bounds, drives the IEEE 802.15.4 radio FIFO and correlates MAC acknowledgments. Host processes retain routing inference and cryptography. All three controls deliver ten of ten packets and return ten verified source receipts each. Each run passes five probes: labeled uncalibrated telemetry, exact 114-byte delivery and acknowledgment, rejection of 115-byte frames, malformed-hex rejection and failed out-of-range transmission. The independent capture audit verifies received bytes against MCU UART output, public sink signatures and packet identities. Development captures are retained for startup synchronization and metadata corrections. A stricter later audit rejects an older greedy capture because its relay-1 final log is missing, despite its retained summary. New runs require all ten offered packet identities at the sink, ten runtime-accepted signed source receipts, complete source/relay final records, five successful probes and a public capture audit before receiving a pass status; all three new controls meet this gate.</w:t>
       </w:r>
     </w:p>
     <w:p>

</xml_diff>

<commit_message>
Update corresponding-author-confirmed authorship, affiliations and declarations
List Shivam Bhardwaj (Assistant Professor, UIM) as first/corresponding author, Abhishek Kumar Pandey (Bennett University) second and Abhinandan Tripathi (Buddha Institute of Technology) third. Add supplied emails and normalized checksum-valid ORCID. Confirm no funding and no competing interests; retain contribution roles and coauthor approval as unconfirmed.
</commit_message>
<xml_diff>
--- a/publication/array/Array_Manuscript.docx
+++ b/publication/array/Array_Manuscript.docx
@@ -29,7 +29,7 @@
           <w:color w:val="000000"/>
           <w:sz w:val="22"/>
         </w:rPr>
-        <w:t>Shivam Bhardwaj, Jitendra Nath Srivastava and Akash Sanghi</w:t>
+        <w:t>Shivam Bhardwaj¹*, Dr. Abhishek Kumar Pandey² and Dr. Abhinandan Tripathi³</w:t>
       </w:r>
     </w:p>
     <w:p>
@@ -44,7 +44,11 @@
           <w:color w:val="000000"/>
           <w:sz w:val="22"/>
         </w:rPr>
-        <w:t>Faculty of Engineering and Technology, Invertis University, Bareilly, Uttar Pradesh 243123, India</w:t>
+        <w:t>¹ Assistant Professor, Department of Computer Applications (MCA), United Institute of Management, Prayagraj, Uttar Pradesh, India</w:t>
+        <w:br/>
+        <w:t>² Department of Computer Science and Engineering, Bennett University, Greater Noida, India</w:t>
+        <w:br/>
+        <w:t>³ Department of Computer Science and Engineering, Buddha Institute of Technology, Gorakhpur, India</w:t>
       </w:r>
     </w:p>
     <w:p>
@@ -58,9 +62,11 @@
           <w:color w:val="000000"/>
           <w:sz w:val="22"/>
         </w:rPr>
-        <w:t>Corresponding author: shibambhardwaj@gmail.com</w:t>
+        <w:t>*Corresponding author: Shivam Bhardwaj; shibambhardwaj@gmail.com</w:t>
         <w:br/>
-        <w:t>Coauthors: jitendranathshrivastava@gmail.com; sanghiakash@gmail.com</w:t>
+        <w:t>Abhishek Kumar Pandey: abhishek.pandey2@bennett.edu.in; ORCID: 0000-0003-3799-9754</w:t>
+        <w:br/>
+        <w:t>Abhinandan Tripathi: abhinandan282@bit.ac.in</w:t>
       </w:r>
     </w:p>
     <w:p>
@@ -2527,7 +2533,7 @@
           <w:color w:val="000000"/>
           <w:sz w:val="22"/>
         </w:rPr>
-        <w:t>No external funding was received. The authors declare no competing interests. This simulation study involved no human participants, clinical data or animal experiments.</w:t>
+        <w:t>No funding was received for this research. The authors declare no competing interests. This simulation and emulation study involved no human participants, clinical data or animal experiments.</w:t>
       </w:r>
     </w:p>
     <w:p>
@@ -2542,20 +2548,6 @@
           <w:sz w:val="22"/>
         </w:rPr>
         <w:t>Data and code availability: code, frozen protocol, checkpoints, historical negative outcomes, raw traces and figure sources are available at https://github.com/DrShivamBhardwaj/JICCE_LA_CPPO_Reproducibility. The pre-outcome source freeze is 4027f071322cb5682f39329f656d76df3b68ff62. The complete earlier evidence manuscript is retained in publication/censored_feedback/.</w:t>
-      </w:r>
-    </w:p>
-    <w:p>
-      <w:pPr>
-        <w:widowControl/>
-        <w:spacing w:line="276" w:lineRule="auto"/>
-      </w:pPr>
-      <w:r>
-        <w:rPr>
-          <w:rFonts w:ascii="Times New Roman" w:hAnsi="Times New Roman"/>
-          <w:color w:val="000000"/>
-          <w:sz w:val="22"/>
-        </w:rPr>
-        <w:t>Author contributions: Shivam Bhardwaj, conceptualization, methodology, software, investigation and original draft; Jitendra Nath Srivastava, validation and review; Akash Sanghi, supervision and review. These roles retain the author-provided source statement.</w:t>
       </w:r>
     </w:p>
     <w:p>

</xml_diff>

<commit_message>
Redesign all eight Array figures with auditable vector artwork and paired plots
Apply Scientific Manuscript Architect conventions and SciSpace-informed evidence boundaries. Export 24 PNG/PDF/SVG assets, source scripts and figure bundle; reconcile 33 intervals and retain all 240 displayed observation values. Replace legacy embedded figures, shorten captions and verify all 27 rendered pages; preserve ten native equations and frozen results.
</commit_message>
<xml_diff>
--- a/publication/array/Array_Manuscript.docx
+++ b/publication/array/Array_Manuscript.docx
@@ -5912,7 +5912,7 @@
         </w:rPr>
         <w:drawing>
           <wp:inline xmlns:a="http://schemas.openxmlformats.org/drawingml/2006/main" xmlns:pic="http://schemas.openxmlformats.org/drawingml/2006/picture">
-            <wp:extent cx="5760000" cy="3897684"/>
+            <wp:extent cx="5760000" cy="3982895"/>
             <wp:docPr id="1" name="Picture 1"/>
             <wp:cNvGraphicFramePr>
               <a:graphicFrameLocks noChangeAspect="1"/>
@@ -5925,7 +5925,7 @@
                     <pic:cNvPicPr/>
                   </pic:nvPicPr>
                   <pic:blipFill>
-                    <a:blip r:embed="rId10"/>
+                    <a:blip r:embed="rId16"/>
                     <a:stretch>
                       <a:fillRect/>
                     </a:stretch>
@@ -5933,7 +5933,7 @@
                   <pic:spPr>
                     <a:xfrm>
                       <a:off x="0" y="0"/>
-                      <a:ext cx="5760000" cy="3897684"/>
+                      <a:ext cx="5760000" cy="3982895"/>
                     </a:xfrm>
                     <a:prstGeom prst="rect"/>
                   </pic:spPr>
@@ -5950,12 +5950,7 @@
         <w:spacing w:line="276" w:lineRule="auto"/>
       </w:pPr>
       <w:r>
-        <w:rPr>
-          <w:rFonts w:ascii="Times New Roman" w:hAnsi="Times New Roman"/>
-          <w:color w:val="000000"/>
-          <w:sz w:val="22"/>
-        </w:rPr>
-        <w:t>Fig. 1. Architecture and state boundaries.</w:t>
+        <w:t>Fig. 1. Frozen benchmark architecture.</w:t>
       </w:r>
     </w:p>
     <w:p>
@@ -5985,7 +5980,7 @@
         </w:rPr>
         <w:drawing>
           <wp:inline xmlns:a="http://schemas.openxmlformats.org/drawingml/2006/main" xmlns:pic="http://schemas.openxmlformats.org/drawingml/2006/picture">
-            <wp:extent cx="5760000" cy="4440907"/>
+            <wp:extent cx="5760000" cy="4523301"/>
             <wp:docPr id="2" name="Picture 2"/>
             <wp:cNvGraphicFramePr>
               <a:graphicFrameLocks noChangeAspect="1"/>
@@ -5998,7 +5993,7 @@
                     <pic:cNvPicPr/>
                   </pic:nvPicPr>
                   <pic:blipFill>
-                    <a:blip r:embed="rId11"/>
+                    <a:blip r:embed="rId10"/>
                     <a:stretch>
                       <a:fillRect/>
                     </a:stretch>
@@ -6006,7 +6001,7 @@
                   <pic:spPr>
                     <a:xfrm>
                       <a:off x="0" y="0"/>
-                      <a:ext cx="5760000" cy="4440907"/>
+                      <a:ext cx="5760000" cy="4523301"/>
                     </a:xfrm>
                     <a:prstGeom prst="rect"/>
                   </pic:spPr>
@@ -6023,12 +6018,7 @@
         <w:spacing w:line="276" w:lineRule="auto"/>
       </w:pPr>
       <w:r>
-        <w:rPr>
-          <w:rFonts w:ascii="Times New Roman" w:hAnsi="Times New Roman"/>
-          <w:color w:val="000000"/>
-          <w:sz w:val="22"/>
-        </w:rPr>
-        <w:t>Fig. 2. Censored feedback flow.</w:t>
+        <w:t>Fig. 2. ACK-gated evidence lifecycle.</w:t>
       </w:r>
     </w:p>
     <w:p>
@@ -6058,7 +6048,7 @@
         </w:rPr>
         <w:drawing>
           <wp:inline xmlns:a="http://schemas.openxmlformats.org/drawingml/2006/main" xmlns:pic="http://schemas.openxmlformats.org/drawingml/2006/picture">
-            <wp:extent cx="5760000" cy="4532591"/>
+            <wp:extent cx="5760000" cy="4282976"/>
             <wp:docPr id="3" name="Picture 3"/>
             <wp:cNvGraphicFramePr>
               <a:graphicFrameLocks noChangeAspect="1"/>
@@ -6071,7 +6061,7 @@
                     <pic:cNvPicPr/>
                   </pic:nvPicPr>
                   <pic:blipFill>
-                    <a:blip r:embed="rId12"/>
+                    <a:blip r:embed="rId11"/>
                     <a:stretch>
                       <a:fillRect/>
                     </a:stretch>
@@ -6079,7 +6069,7 @@
                   <pic:spPr>
                     <a:xfrm>
                       <a:off x="0" y="0"/>
-                      <a:ext cx="5760000" cy="4532591"/>
+                      <a:ext cx="5760000" cy="4282976"/>
                     </a:xfrm>
                     <a:prstGeom prst="rect"/>
                   </pic:spPr>
@@ -6096,12 +6086,7 @@
         <w:spacing w:line="276" w:lineRule="auto"/>
       </w:pPr>
       <w:r>
-        <w:rPr>
-          <w:rFonts w:ascii="Times New Roman" w:hAnsi="Times New Roman"/>
-          <w:color w:val="000000"/>
-          <w:sz w:val="22"/>
-        </w:rPr>
-        <w:t>Fig. 3. Frozen evaluation flow.</w:t>
+        <w:t>Fig. 3. Frozen evaluation stages.</w:t>
       </w:r>
     </w:p>
     <w:p>
@@ -6131,7 +6116,7 @@
         </w:rPr>
         <w:drawing>
           <wp:inline xmlns:a="http://schemas.openxmlformats.org/drawingml/2006/main" xmlns:pic="http://schemas.openxmlformats.org/drawingml/2006/picture">
-            <wp:extent cx="5760000" cy="2902783"/>
+            <wp:extent cx="5760000" cy="2956683"/>
             <wp:docPr id="4" name="Picture 4"/>
             <wp:cNvGraphicFramePr>
               <a:graphicFrameLocks noChangeAspect="1"/>
@@ -6144,7 +6129,7 @@
                     <pic:cNvPicPr/>
                   </pic:nvPicPr>
                   <pic:blipFill>
-                    <a:blip r:embed="rId13"/>
+                    <a:blip r:embed="rId12"/>
                     <a:stretch>
                       <a:fillRect/>
                     </a:stretch>
@@ -6152,7 +6137,7 @@
                   <pic:spPr>
                     <a:xfrm>
                       <a:off x="0" y="0"/>
-                      <a:ext cx="5760000" cy="2902783"/>
+                      <a:ext cx="5760000" cy="2956683"/>
                     </a:xfrm>
                     <a:prstGeom prst="rect"/>
                   </pic:spPr>
@@ -6169,12 +6154,7 @@
         <w:spacing w:line="276" w:lineRule="auto"/>
       </w:pPr>
       <w:r>
-        <w:rPr>
-          <w:rFonts w:ascii="Times New Roman" w:hAnsi="Times New Roman"/>
-          <w:color w:val="000000"/>
-          <w:sz w:val="22"/>
-        </w:rPr>
-        <w:t>Fig. 4. Delivery effects with paired 95% intervals.</w:t>
+        <w:t>Fig. 4. Delivery effects across settings.</w:t>
       </w:r>
     </w:p>
     <w:p>
@@ -6204,7 +6184,7 @@
         </w:rPr>
         <w:drawing>
           <wp:inline xmlns:a="http://schemas.openxmlformats.org/drawingml/2006/main" xmlns:pic="http://schemas.openxmlformats.org/drawingml/2006/picture">
-            <wp:extent cx="5760000" cy="2954592"/>
+            <wp:extent cx="5760000" cy="3170897"/>
             <wp:docPr id="5" name="Picture 5"/>
             <wp:cNvGraphicFramePr>
               <a:graphicFrameLocks noChangeAspect="1"/>
@@ -6217,7 +6197,7 @@
                     <pic:cNvPicPr/>
                   </pic:nvPicPr>
                   <pic:blipFill>
-                    <a:blip r:embed="rId14"/>
+                    <a:blip r:embed="rId13"/>
                     <a:stretch>
                       <a:fillRect/>
                     </a:stretch>
@@ -6225,7 +6205,7 @@
                   <pic:spPr>
                     <a:xfrm>
                       <a:off x="0" y="0"/>
-                      <a:ext cx="5760000" cy="2954592"/>
+                      <a:ext cx="5760000" cy="3170897"/>
                     </a:xfrm>
                     <a:prstGeom prst="rect"/>
                   </pic:spPr>
@@ -6242,12 +6222,7 @@
         <w:spacing w:line="276" w:lineRule="auto"/>
       </w:pPr>
       <w:r>
-        <w:rPr>
-          <w:rFonts w:ascii="Times New Roman" w:hAnsi="Times New Roman"/>
-          <w:color w:val="000000"/>
-          <w:sz w:val="22"/>
-        </w:rPr>
-        <w:t>Fig. 5. Blackhole fixture outcomes and paired effects.</w:t>
+        <w:t>Fig. 5. Blackhole observations and effects.</w:t>
       </w:r>
     </w:p>
     <w:p>
@@ -6277,7 +6252,7 @@
         </w:rPr>
         <w:drawing>
           <wp:inline xmlns:a="http://schemas.openxmlformats.org/drawingml/2006/main" xmlns:pic="http://schemas.openxmlformats.org/drawingml/2006/picture">
-            <wp:extent cx="5760000" cy="2970502"/>
+            <wp:extent cx="5760000" cy="2888411"/>
             <wp:docPr id="6" name="Picture 6"/>
             <wp:cNvGraphicFramePr>
               <a:graphicFrameLocks noChangeAspect="1"/>
@@ -6290,7 +6265,7 @@
                     <pic:cNvPicPr/>
                   </pic:nvPicPr>
                   <pic:blipFill>
-                    <a:blip r:embed="rId15"/>
+                    <a:blip r:embed="rId14"/>
                     <a:stretch>
                       <a:fillRect/>
                     </a:stretch>
@@ -6298,7 +6273,7 @@
                   <pic:spPr>
                     <a:xfrm>
                       <a:off x="0" y="0"/>
-                      <a:ext cx="5760000" cy="2970502"/>
+                      <a:ext cx="5760000" cy="2888411"/>
                     </a:xfrm>
                     <a:prstGeom prst="rect"/>
                   </pic:spPr>
@@ -6315,12 +6290,7 @@
         <w:spacing w:line="276" w:lineRule="auto"/>
       </w:pPr>
       <w:r>
-        <w:rPr>
-          <w:rFonts w:ascii="Times New Roman" w:hAnsi="Times New Roman"/>
-          <w:color w:val="000000"/>
-          <w:sz w:val="22"/>
-        </w:rPr>
-        <w:t>Fig. 6. Radio effects with paired 95% intervals.</w:t>
+        <w:t>Fig. 6. Modeled radio-energy attribution.</w:t>
       </w:r>
     </w:p>
     <w:p>
@@ -6983,7 +6953,7 @@
       <w:r>
         <w:drawing>
           <wp:inline xmlns:a="http://schemas.openxmlformats.org/drawingml/2006/main" xmlns:pic="http://schemas.openxmlformats.org/drawingml/2006/picture">
-            <wp:extent cx="5760000" cy="4142022"/>
+            <wp:extent cx="5760000" cy="4403789"/>
             <wp:docPr id="7" name="Picture 7"/>
             <wp:cNvGraphicFramePr>
               <a:graphicFrameLocks noChangeAspect="1"/>
@@ -6996,7 +6966,7 @@
                     <pic:cNvPicPr/>
                   </pic:nvPicPr>
                   <pic:blipFill>
-                    <a:blip r:embed="rId16"/>
+                    <a:blip r:embed="rId15"/>
                     <a:stretch>
                       <a:fillRect/>
                     </a:stretch>
@@ -7004,7 +6974,7 @@
                   <pic:spPr>
                     <a:xfrm>
                       <a:off x="0" y="0"/>
-                      <a:ext cx="5760000" cy="4142022"/>
+                      <a:ext cx="5760000" cy="4403789"/>
                     </a:xfrm>
                     <a:prstGeom prst="rect"/>
                   </pic:spPr>
@@ -7032,7 +7002,7 @@
       <w:r>
         <w:drawing>
           <wp:inline xmlns:a="http://schemas.openxmlformats.org/drawingml/2006/main" xmlns:pic="http://schemas.openxmlformats.org/drawingml/2006/picture">
-            <wp:extent cx="5760000" cy="3999730"/>
+            <wp:extent cx="5760000" cy="4737285"/>
             <wp:docPr id="8" name="Picture 8"/>
             <wp:cNvGraphicFramePr>
               <a:graphicFrameLocks noChangeAspect="1"/>
@@ -7053,7 +7023,7 @@
                   <pic:spPr>
                     <a:xfrm>
                       <a:off x="0" y="0"/>
-                      <a:ext cx="5760000" cy="3999730"/>
+                      <a:ext cx="5760000" cy="4737285"/>
                     </a:xfrm>
                     <a:prstGeom prst="rect"/>
                   </pic:spPr>

</xml_diff>